<commit_message>
docs(qa): drop the time-spent fields from the Track 4 pack
Removed from both places they appeared: the per-run Result line under each of
the 26 runs, and the "Total time spent" column on the sign-off footer.

The Time column in the contents table is left alone - that is an up-front
estimate to help a tester plan their sessions, not something they record
afterwards. Say the word if that should go too.

Co-Authored-By: Claude Opus 5 <noreply@anthropic.com>
</commit_message>
<xml_diff>
--- a/docs/qa/Track-4-Finance-Ledger-and-Receivables.docx
+++ b/docs/qa/Track-4-Finance-Ledger-and-Receivables.docx
@@ -4877,7 +4877,7 @@
           <w:sz w:val="18"/>
           <w:szCs w:val="18"/>
         </w:rPr>
-        <w:t xml:space="preserve">Result:  pass  /  fail  /  blocked          Ticket no: ______________          Time spent: ______</w:t>
+        <w:t xml:space="preserve">Result:  pass  /  fail  /  blocked          Ticket no: ______________</w:t>
       </w:r>
     </w:p>
     <w:p>
@@ -5337,7 +5337,7 @@
           <w:sz w:val="18"/>
           <w:szCs w:val="18"/>
         </w:rPr>
-        <w:t xml:space="preserve">Result:  pass  /  fail  /  blocked          Ticket no: ______________          Time spent: ______</w:t>
+        <w:t xml:space="preserve">Result:  pass  /  fail  /  blocked          Ticket no: ______________</w:t>
       </w:r>
     </w:p>
     <w:p>
@@ -5794,7 +5794,7 @@
           <w:sz w:val="18"/>
           <w:szCs w:val="18"/>
         </w:rPr>
-        <w:t xml:space="preserve">Result:  pass  /  fail  /  blocked          Ticket no: ______________          Time spent: ______</w:t>
+        <w:t xml:space="preserve">Result:  pass  /  fail  /  blocked          Ticket no: ______________</w:t>
       </w:r>
     </w:p>
     <w:p>
@@ -6154,7 +6154,7 @@
           <w:sz w:val="18"/>
           <w:szCs w:val="18"/>
         </w:rPr>
-        <w:t xml:space="preserve">Result:  pass  /  fail  /  blocked          Ticket no: ______________          Time spent: ______</w:t>
+        <w:t xml:space="preserve">Result:  pass  /  fail  /  blocked          Ticket no: ______________</w:t>
       </w:r>
     </w:p>
     <w:p>
@@ -6530,7 +6530,7 @@
           <w:sz w:val="18"/>
           <w:szCs w:val="18"/>
         </w:rPr>
-        <w:t xml:space="preserve">Result:  pass  /  fail  /  blocked          Ticket no: ______________          Time spent: ______</w:t>
+        <w:t xml:space="preserve">Result:  pass  /  fail  /  blocked          Ticket no: ______________</w:t>
       </w:r>
     </w:p>
     <w:p>
@@ -6845,7 +6845,7 @@
           <w:sz w:val="18"/>
           <w:szCs w:val="18"/>
         </w:rPr>
-        <w:t xml:space="preserve">Result:  pass  /  fail  /  blocked          Ticket no: ______________          Time spent: ______</w:t>
+        <w:t xml:space="preserve">Result:  pass  /  fail  /  blocked          Ticket no: ______________</w:t>
       </w:r>
     </w:p>
     <w:p>
@@ -7205,7 +7205,7 @@
           <w:sz w:val="18"/>
           <w:szCs w:val="18"/>
         </w:rPr>
-        <w:t xml:space="preserve">Result:  pass  /  fail  /  blocked          Ticket no: ______________          Time spent: ______</w:t>
+        <w:t xml:space="preserve">Result:  pass  /  fail  /  blocked          Ticket no: ______________</w:t>
       </w:r>
     </w:p>
     <w:p>
@@ -7701,7 +7701,7 @@
           <w:sz w:val="18"/>
           <w:szCs w:val="18"/>
         </w:rPr>
-        <w:t xml:space="preserve">Result:  pass  /  fail  /  blocked          Ticket no: ______________          Time spent: ______</w:t>
+        <w:t xml:space="preserve">Result:  pass  /  fail  /  blocked          Ticket no: ______________</w:t>
       </w:r>
     </w:p>
     <w:p>
@@ -8286,7 +8286,7 @@
           <w:sz w:val="18"/>
           <w:szCs w:val="18"/>
         </w:rPr>
-        <w:t xml:space="preserve">Result:  pass  /  fail  /  blocked          Ticket no: ______________          Time spent: ______</w:t>
+        <w:t xml:space="preserve">Result:  pass  /  fail  /  blocked          Ticket no: ______________</w:t>
       </w:r>
     </w:p>
     <w:p>
@@ -8675,7 +8675,7 @@
           <w:sz w:val="18"/>
           <w:szCs w:val="18"/>
         </w:rPr>
-        <w:t xml:space="preserve">Result:  pass  /  fail  /  blocked          Ticket no: ______________          Time spent: ______</w:t>
+        <w:t xml:space="preserve">Result:  pass  /  fail  /  blocked          Ticket no: ______________</w:t>
       </w:r>
     </w:p>
     <w:p>
@@ -9026,7 +9026,7 @@
           <w:sz w:val="18"/>
           <w:szCs w:val="18"/>
         </w:rPr>
-        <w:t xml:space="preserve">Result:  pass  /  fail  /  blocked          Ticket no: ______________          Time spent: ______</w:t>
+        <w:t xml:space="preserve">Result:  pass  /  fail  /  blocked          Ticket no: ______________</w:t>
       </w:r>
     </w:p>
     <w:p>
@@ -9690,7 +9690,7 @@
           <w:sz w:val="18"/>
           <w:szCs w:val="18"/>
         </w:rPr>
-        <w:t xml:space="preserve">Result:  pass  /  fail  /  blocked          Ticket no: ______________          Time spent: ______</w:t>
+        <w:t xml:space="preserve">Result:  pass  /  fail  /  blocked          Ticket no: ______________</w:t>
       </w:r>
     </w:p>
     <w:p>
@@ -10361,7 +10361,7 @@
           <w:sz w:val="18"/>
           <w:szCs w:val="18"/>
         </w:rPr>
-        <w:t xml:space="preserve">Result:  pass  /  fail  /  blocked          Ticket no: ______________          Time spent: ______</w:t>
+        <w:t xml:space="preserve">Result:  pass  /  fail  /  blocked          Ticket no: ______________</w:t>
       </w:r>
     </w:p>
     <w:p>
@@ -10863,7 +10863,7 @@
           <w:sz w:val="18"/>
           <w:szCs w:val="18"/>
         </w:rPr>
-        <w:t xml:space="preserve">Result:  pass  /  fail  /  blocked          Ticket no: ______________          Time spent: ______</w:t>
+        <w:t xml:space="preserve">Result:  pass  /  fail  /  blocked          Ticket no: ______________</w:t>
       </w:r>
     </w:p>
     <w:p>
@@ -11451,7 +11451,7 @@
           <w:sz w:val="18"/>
           <w:szCs w:val="18"/>
         </w:rPr>
-        <w:t xml:space="preserve">Result:  pass  /  fail  /  blocked          Ticket no: ______________          Time spent: ______</w:t>
+        <w:t xml:space="preserve">Result:  pass  /  fail  /  blocked          Ticket no: ______________</w:t>
       </w:r>
     </w:p>
     <w:p>
@@ -11934,7 +11934,7 @@
           <w:sz w:val="18"/>
           <w:szCs w:val="18"/>
         </w:rPr>
-        <w:t xml:space="preserve">Result:  pass  /  fail  /  blocked          Ticket no: ______________          Time spent: ______</w:t>
+        <w:t xml:space="preserve">Result:  pass  /  fail  /  blocked          Ticket no: ______________</w:t>
       </w:r>
     </w:p>
     <w:p>
@@ -12439,7 +12439,7 @@
           <w:sz w:val="18"/>
           <w:szCs w:val="18"/>
         </w:rPr>
-        <w:t xml:space="preserve">Result:  pass  /  fail  /  blocked          Ticket no: ______________          Time spent: ______</w:t>
+        <w:t xml:space="preserve">Result:  pass  /  fail  /  blocked          Ticket no: ______________</w:t>
       </w:r>
     </w:p>
     <w:p>
@@ -13008,7 +13008,7 @@
           <w:sz w:val="18"/>
           <w:szCs w:val="18"/>
         </w:rPr>
-        <w:t xml:space="preserve">Result:  pass  /  fail  /  blocked          Ticket no: ______________          Time spent: ______</w:t>
+        <w:t xml:space="preserve">Result:  pass  /  fail  /  blocked          Ticket no: ______________</w:t>
       </w:r>
     </w:p>
     <w:p>
@@ -13603,7 +13603,7 @@
           <w:sz w:val="18"/>
           <w:szCs w:val="18"/>
         </w:rPr>
-        <w:t xml:space="preserve">Result:  pass  /  fail  /  blocked          Ticket no: ______________          Time spent: ______</w:t>
+        <w:t xml:space="preserve">Result:  pass  /  fail  /  blocked          Ticket no: ______________</w:t>
       </w:r>
     </w:p>
     <w:p>
@@ -14146,7 +14146,7 @@
           <w:sz w:val="18"/>
           <w:szCs w:val="18"/>
         </w:rPr>
-        <w:t xml:space="preserve">Result:  pass  /  fail  /  blocked          Ticket no: ______________          Time spent: ______</w:t>
+        <w:t xml:space="preserve">Result:  pass  /  fail  /  blocked          Ticket no: ______________</w:t>
       </w:r>
     </w:p>
     <w:p>
@@ -14712,7 +14712,7 @@
           <w:sz w:val="18"/>
           <w:szCs w:val="18"/>
         </w:rPr>
-        <w:t xml:space="preserve">Result:  pass  /  fail  /  blocked          Ticket no: ______________          Time spent: ______</w:t>
+        <w:t xml:space="preserve">Result:  pass  /  fail  /  blocked          Ticket no: ______________</w:t>
       </w:r>
     </w:p>
     <w:p>
@@ -15172,7 +15172,7 @@
           <w:sz w:val="18"/>
           <w:szCs w:val="18"/>
         </w:rPr>
-        <w:t xml:space="preserve">Result:  pass  /  fail  /  blocked          Ticket no: ______________          Time spent: ______</w:t>
+        <w:t xml:space="preserve">Result:  pass  /  fail  /  blocked          Ticket no: ______________</w:t>
       </w:r>
     </w:p>
     <w:p>
@@ -15658,7 +15658,7 @@
           <w:sz w:val="18"/>
           <w:szCs w:val="18"/>
         </w:rPr>
-        <w:t xml:space="preserve">Result:  pass  /  fail  /  blocked          Ticket no: ______________          Time spent: ______</w:t>
+        <w:t xml:space="preserve">Result:  pass  /  fail  /  blocked          Ticket no: ______________</w:t>
       </w:r>
     </w:p>
     <w:p>
@@ -16170,7 +16170,7 @@
           <w:sz w:val="18"/>
           <w:szCs w:val="18"/>
         </w:rPr>
-        <w:t xml:space="preserve">Result:  pass  /  fail  /  blocked          Ticket no: ______________          Time spent: ______</w:t>
+        <w:t xml:space="preserve">Result:  pass  /  fail  /  blocked          Ticket no: ______________</w:t>
       </w:r>
     </w:p>
     <w:p>
@@ -16578,7 +16578,7 @@
           <w:sz w:val="18"/>
           <w:szCs w:val="18"/>
         </w:rPr>
-        <w:t xml:space="preserve">Result:  pass  /  fail  /  blocked          Ticket no: ______________          Time spent: ______</w:t>
+        <w:t xml:space="preserve">Result:  pass  /  fail  /  blocked          Ticket no: ______________</w:t>
       </w:r>
     </w:p>
     <w:p>
@@ -16912,7 +16912,7 @@
           <w:sz w:val="18"/>
           <w:szCs w:val="18"/>
         </w:rPr>
-        <w:t xml:space="preserve">Result:  pass  /  fail  /  blocked          Ticket no: ______________          Time spent: ______</w:t>
+        <w:t xml:space="preserve">Result:  pass  /  fail  /  blocked          Ticket no: ______________</w:t>
       </w:r>
     </w:p>
     <w:p>
@@ -20669,9 +20669,8 @@
         </w:tblBorders>
       </w:tblPr>
       <w:tblGrid>
+        <w:gridCol w:w="5360"/>
         <w:gridCol w:w="4000"/>
-        <w:gridCol w:w="2680"/>
-        <w:gridCol w:w="2680"/>
       </w:tblGrid>
       <w:tr>
         <w:trPr>
@@ -20679,6 +20678,34 @@
         </w:trPr>
         <w:tc>
           <w:tcPr>
+            <w:tcW w:type="dxa" w:w="5360"/>
+            <w:shd w:fill="EAF0F6" w:color="auto" w:val="clear"/>
+            <w:tcMar>
+              <w:top w:type="dxa" w:w="80"/>
+              <w:left w:type="dxa" w:w="120"/>
+              <w:bottom w:type="dxa" w:w="80"/>
+              <w:right w:type="dxa" w:w="120"/>
+            </w:tcMar>
+          </w:tcPr>
+          <w:p>
+            <w:pPr>
+              <w:spacing w:after="0" w:line="264"/>
+            </w:pPr>
+            <w:r>
+              <w:rPr>
+                <w:rFonts w:ascii="Calibri" w:cs="Calibri" w:eastAsia="Calibri" w:hAnsi="Calibri"/>
+                <w:b/>
+                <w:bCs/>
+                <w:color w:val="1A1A1A"/>
+                <w:sz w:val="19"/>
+                <w:szCs w:val="19"/>
+              </w:rPr>
+              <w:t xml:space="preserve">Tester signature</w:t>
+            </w:r>
+          </w:p>
+        </w:tc>
+        <w:tc>
+          <w:tcPr>
             <w:tcW w:type="dxa" w:w="4000"/>
             <w:shd w:fill="EAF0F6" w:color="auto" w:val="clear"/>
             <w:tcMar>
@@ -20701,63 +20728,7 @@
                 <w:sz w:val="19"/>
                 <w:szCs w:val="19"/>
               </w:rPr>
-              <w:t xml:space="preserve">Tester signature</w:t>
-            </w:r>
-          </w:p>
-        </w:tc>
-        <w:tc>
-          <w:tcPr>
-            <w:tcW w:type="dxa" w:w="2680"/>
-            <w:shd w:fill="EAF0F6" w:color="auto" w:val="clear"/>
-            <w:tcMar>
-              <w:top w:type="dxa" w:w="80"/>
-              <w:left w:type="dxa" w:w="120"/>
-              <w:bottom w:type="dxa" w:w="80"/>
-              <w:right w:type="dxa" w:w="120"/>
-            </w:tcMar>
-          </w:tcPr>
-          <w:p>
-            <w:pPr>
-              <w:spacing w:after="0" w:line="264"/>
-            </w:pPr>
-            <w:r>
-              <w:rPr>
-                <w:rFonts w:ascii="Calibri" w:cs="Calibri" w:eastAsia="Calibri" w:hAnsi="Calibri"/>
-                <w:b/>
-                <w:bCs/>
-                <w:color w:val="1A1A1A"/>
-                <w:sz w:val="19"/>
-                <w:szCs w:val="19"/>
-              </w:rPr>
               <w:t xml:space="preserve">Date</w:t>
-            </w:r>
-          </w:p>
-        </w:tc>
-        <w:tc>
-          <w:tcPr>
-            <w:tcW w:type="dxa" w:w="2680"/>
-            <w:shd w:fill="EAF0F6" w:color="auto" w:val="clear"/>
-            <w:tcMar>
-              <w:top w:type="dxa" w:w="80"/>
-              <w:left w:type="dxa" w:w="120"/>
-              <w:bottom w:type="dxa" w:w="80"/>
-              <w:right w:type="dxa" w:w="120"/>
-            </w:tcMar>
-          </w:tcPr>
-          <w:p>
-            <w:pPr>
-              <w:spacing w:after="0" w:line="264"/>
-            </w:pPr>
-            <w:r>
-              <w:rPr>
-                <w:rFonts w:ascii="Calibri" w:cs="Calibri" w:eastAsia="Calibri" w:hAnsi="Calibri"/>
-                <w:b/>
-                <w:bCs/>
-                <w:color w:val="1A1A1A"/>
-                <w:sz w:val="19"/>
-                <w:szCs w:val="19"/>
-              </w:rPr>
-              <w:t xml:space="preserve">Total time spent</w:t>
             </w:r>
           </w:p>
         </w:tc>
@@ -20768,7 +20739,7 @@
         </w:trPr>
         <w:tc>
           <w:tcPr>
-            <w:tcW w:type="dxa" w:w="4000"/>
+            <w:tcW w:type="dxa" w:w="5360"/>
             <w:tcMar>
               <w:top w:type="dxa" w:w="80"/>
               <w:left w:type="dxa" w:w="120"/>
@@ -20795,34 +20766,7 @@
         </w:tc>
         <w:tc>
           <w:tcPr>
-            <w:tcW w:type="dxa" w:w="2680"/>
-            <w:tcMar>
-              <w:top w:type="dxa" w:w="80"/>
-              <w:left w:type="dxa" w:w="120"/>
-              <w:bottom w:type="dxa" w:w="80"/>
-              <w:right w:type="dxa" w:w="120"/>
-            </w:tcMar>
-          </w:tcPr>
-          <w:p>
-            <w:pPr>
-              <w:spacing w:after="0" w:line="264"/>
-            </w:pPr>
-            <w:r>
-              <w:rPr>
-                <w:rFonts w:ascii="Calibri" w:cs="Calibri" w:eastAsia="Calibri" w:hAnsi="Calibri"/>
-                <w:b w:val="false"/>
-                <w:bCs w:val="false"/>
-                <w:color w:val="1A1A1A"/>
-                <w:sz w:val="19"/>
-                <w:szCs w:val="19"/>
-              </w:rPr>
-              <w:t xml:space="preserve"/>
-            </w:r>
-          </w:p>
-        </w:tc>
-        <w:tc>
-          <w:tcPr>
-            <w:tcW w:type="dxa" w:w="2680"/>
+            <w:tcW w:type="dxa" w:w="4000"/>
             <w:tcMar>
               <w:top w:type="dxa" w:w="80"/>
               <w:left w:type="dxa" w:w="120"/>

</xml_diff>

<commit_message>
docs(qa): drop the sign-in steps, and name Chidera instead of "your lead"
The six testers already have the staging address and their accounts, so the
first two steps of section 1.2 were telling them something they know. Removed
both; the section now opens at "Click Finance in the left sidebar" and its
heading reads "The first five minutes", which is what three short steps
actually take.

Every reference to "your lead" is now "Chidera" - eight of them, across the
cover page, the ticket fallback, the entity-switcher note, the permissions
item, the cross-track table, the smoke-test callout, and runs A3 and A4. A
name is a person somebody can actually go to; "your lead" is a role a new
tester has to work out first.

Left in place: the cover page's Staging address and sign-in email rows. They
are not instructions, they pin which environment and account this pack was
run against, which matters once there is more than one.

Co-Authored-By: Claude Opus 5 <noreply@anthropic.com>
</commit_message>
<xml_diff>
--- a/docs/qa/Track-4-Finance-Ledger-and-Receivables.docx
+++ b/docs/qa/Track-4-Finance-Ledger-and-Receivables.docx
@@ -493,7 +493,7 @@
                 <w:sz w:val="19"/>
                 <w:szCs w:val="19"/>
               </w:rPr>
-              <w:t xml:space="preserve">CODEX  (unless your lead says otherwise)</w:t>
+              <w:t xml:space="preserve">CODEX  (unless Chidera says otherwise)</w:t>
             </w:r>
           </w:p>
         </w:tc>
@@ -1549,7 +1549,7 @@
           <w:sz w:val="26"/>
           <w:szCs w:val="26"/>
         </w:rPr>
-        <w:t xml:space="preserve">1.2  The first ten minutes</w:t>
+        <w:t xml:space="preserve">1.2  The first five minutes</w:t>
       </w:r>
     </w:p>
     <w:p>
@@ -1571,22 +1571,11 @@
       <w:r>
         <w:rPr>
           <w:rFonts w:ascii="Calibri" w:cs="Calibri" w:eastAsia="Calibri" w:hAnsi="Calibri"/>
-          <w:b/>
-          <w:bCs/>
-          <w:color w:val="B03030"/>
-          <w:sz w:val="21"/>
-          <w:szCs w:val="21"/>
-        </w:rPr>
-        <w:t xml:space="preserve">Open the staging address written on the cover page</w:t>
-      </w:r>
-      <w:r>
-        <w:rPr>
-          <w:rFonts w:ascii="Calibri" w:cs="Calibri" w:eastAsia="Calibri" w:hAnsi="Calibri"/>
-          <w:color w:val="1A1A1A"/>
-          <w:sz w:val="21"/>
-          <w:szCs w:val="21"/>
-        </w:rPr>
-        <w:t xml:space="preserve">. Sign in with the account your lead gave you.</w:t>
+          <w:color w:val="1A1A1A"/>
+          <w:sz w:val="21"/>
+          <w:szCs w:val="21"/>
+        </w:rPr>
+        <w:t xml:space="preserve">Click Finance in the left sidebar. The console opens with its own sidebar down the left: Dashboard, then Ledger and Setup, Receivables, Operations, Payments, Reports and Close, Administration.</w:t>
       </w:r>
     </w:p>
     <w:p>
@@ -1612,7 +1601,47 @@
           <w:sz w:val="21"/>
           <w:szCs w:val="21"/>
         </w:rPr>
-        <w:t xml:space="preserve">If you have never signed in before, you will have received an activation link by email. Use it to set your password. If it does not arrive, tell your lead straight away rather than raising a ticket, because you are blocked until then.</w:t>
+        <w:t xml:space="preserve">Look at the top of the page for the </w:t>
+      </w:r>
+      <w:r>
+        <w:rPr>
+          <w:rFonts w:ascii="Calibri" w:cs="Calibri" w:eastAsia="Calibri" w:hAnsi="Calibri"/>
+          <w:b/>
+          <w:bCs/>
+          <w:color w:val="1A1A1A"/>
+          <w:sz w:val="21"/>
+          <w:szCs w:val="21"/>
+        </w:rPr>
+        <w:t xml:space="preserve">entity switcher</w:t>
+      </w:r>
+      <w:r>
+        <w:rPr>
+          <w:rFonts w:ascii="Calibri" w:cs="Calibri" w:eastAsia="Calibri" w:hAnsi="Calibri"/>
+          <w:color w:val="1A1A1A"/>
+          <w:sz w:val="21"/>
+          <w:szCs w:val="21"/>
+        </w:rPr>
+        <w:t xml:space="preserve">. Choose </w:t>
+      </w:r>
+      <w:r>
+        <w:rPr>
+          <w:rFonts w:ascii="Calibri" w:cs="Calibri" w:eastAsia="Calibri" w:hAnsi="Calibri"/>
+          <w:b/>
+          <w:bCs/>
+          <w:color w:val="1A1A1A"/>
+          <w:sz w:val="21"/>
+          <w:szCs w:val="21"/>
+        </w:rPr>
+        <w:t xml:space="preserve">CODEX</w:t>
+      </w:r>
+      <w:r>
+        <w:rPr>
+          <w:rFonts w:ascii="Calibri" w:cs="Calibri" w:eastAsia="Calibri" w:hAnsi="Calibri"/>
+          <w:color w:val="1A1A1A"/>
+          <w:sz w:val="21"/>
+          <w:szCs w:val="21"/>
+        </w:rPr>
+        <w:t xml:space="preserve">. Read the next section before you go any further, because nothing else in this pack works until you have done this.</w:t>
       </w:r>
     </w:p>
     <w:p>
@@ -1638,99 +1667,7 @@
           <w:sz w:val="21"/>
           <w:szCs w:val="21"/>
         </w:rPr>
-        <w:t xml:space="preserve">Click Finance in the left sidebar. The console opens with its own sidebar down the left: Dashboard, then Ledger and Setup, Receivables, Operations, Payments, Reports and Close, Administration.</w:t>
-      </w:r>
-    </w:p>
-    <w:p>
-      <w:pPr>
-        <w:spacing w:after="70" w:line="276"/>
-        <w:ind w:left="403" w:hanging="403"/>
-      </w:pPr>
-      <w:r>
-        <w:rPr>
-          <w:rFonts w:ascii="Calibri" w:cs="Calibri" w:eastAsia="Calibri" w:hAnsi="Calibri"/>
-          <w:b/>
-          <w:bCs/>
-          <w:color w:val="1A1A1A"/>
-          <w:sz w:val="21"/>
-          <w:szCs w:val="21"/>
-        </w:rPr>
-        <w:t xml:space="preserve">4.  </w:t>
-      </w:r>
-      <w:r>
-        <w:rPr>
-          <w:rFonts w:ascii="Calibri" w:cs="Calibri" w:eastAsia="Calibri" w:hAnsi="Calibri"/>
-          <w:color w:val="1A1A1A"/>
-          <w:sz w:val="21"/>
-          <w:szCs w:val="21"/>
-        </w:rPr>
-        <w:t xml:space="preserve">Look at the top of the page for the </w:t>
-      </w:r>
-      <w:r>
-        <w:rPr>
-          <w:rFonts w:ascii="Calibri" w:cs="Calibri" w:eastAsia="Calibri" w:hAnsi="Calibri"/>
-          <w:b/>
-          <w:bCs/>
-          <w:color w:val="1A1A1A"/>
-          <w:sz w:val="21"/>
-          <w:szCs w:val="21"/>
-        </w:rPr>
-        <w:t xml:space="preserve">entity switcher</w:t>
-      </w:r>
-      <w:r>
-        <w:rPr>
-          <w:rFonts w:ascii="Calibri" w:cs="Calibri" w:eastAsia="Calibri" w:hAnsi="Calibri"/>
-          <w:color w:val="1A1A1A"/>
-          <w:sz w:val="21"/>
-          <w:szCs w:val="21"/>
-        </w:rPr>
-        <w:t xml:space="preserve">. Choose </w:t>
-      </w:r>
-      <w:r>
-        <w:rPr>
-          <w:rFonts w:ascii="Calibri" w:cs="Calibri" w:eastAsia="Calibri" w:hAnsi="Calibri"/>
-          <w:b/>
-          <w:bCs/>
-          <w:color w:val="1A1A1A"/>
-          <w:sz w:val="21"/>
-          <w:szCs w:val="21"/>
-        </w:rPr>
-        <w:t xml:space="preserve">CODEX</w:t>
-      </w:r>
-      <w:r>
-        <w:rPr>
-          <w:rFonts w:ascii="Calibri" w:cs="Calibri" w:eastAsia="Calibri" w:hAnsi="Calibri"/>
-          <w:color w:val="1A1A1A"/>
-          <w:sz w:val="21"/>
-          <w:szCs w:val="21"/>
-        </w:rPr>
-        <w:t xml:space="preserve">. Read the next section before you go any further, because nothing else in this pack works until you have done this.</w:t>
-      </w:r>
-    </w:p>
-    <w:p>
-      <w:pPr>
-        <w:spacing w:after="70" w:line="276"/>
-        <w:ind w:left="403" w:hanging="403"/>
-      </w:pPr>
-      <w:r>
-        <w:rPr>
-          <w:rFonts w:ascii="Calibri" w:cs="Calibri" w:eastAsia="Calibri" w:hAnsi="Calibri"/>
-          <w:b/>
-          <w:bCs/>
-          <w:color w:val="1A1A1A"/>
-          <w:sz w:val="21"/>
-          <w:szCs w:val="21"/>
-        </w:rPr>
-        <w:t xml:space="preserve">5.  </w:t>
-      </w:r>
-      <w:r>
-        <w:rPr>
-          <w:rFonts w:ascii="Calibri" w:cs="Calibri" w:eastAsia="Calibri" w:hAnsi="Calibri"/>
-          <w:color w:val="1A1A1A"/>
-          <w:sz w:val="21"/>
-          <w:szCs w:val="21"/>
-        </w:rPr>
-        <w:t xml:space="preserve">Open Support in the main sidebar and create one throwaway ticket titled "QA4 smoke test, please ignore". This proves your reporting channel works before you need it in anger. If ticket creation itself fails, message your lead directly.</w:t>
+        <w:t xml:space="preserve">Open Support in the main sidebar and create one throwaway ticket titled "QA4 smoke test, please ignore". This proves your reporting channel works before you need it in anger. If ticket creation itself fails, message Chidera directly.</w:t>
       </w:r>
     </w:p>
     <w:p>
@@ -1808,7 +1745,7 @@
           <w:sz w:val="18"/>
           <w:szCs w:val="18"/>
         </w:rPr>
-        <w:t xml:space="preserve">The switcher only appears when the tenant has more than one entity. If you cannot see it at all, you may be on a tenant with a single set of books. Ask your lead to confirm before reporting it.</w:t>
+        <w:t xml:space="preserve">The switcher only appears when the tenant has more than one entity. If you cannot see it at all, you may be on a tenant with a single set of books. Ask Chidera to confirm before reporting it.</w:t>
       </w:r>
     </w:p>
     <w:p>
@@ -2183,7 +2120,7 @@
                 <w:sz w:val="20"/>
                 <w:szCs w:val="20"/>
               </w:rPr>
-              <w:t xml:space="preserve">7.  A screen that is missing from the sidebar entirely is a permissions matter, not a bug. Tell your lead so your account can be granted the key, and note it as blocked.</w:t>
+              <w:t xml:space="preserve">7.  A screen that is missing from the sidebar entirely is a permissions matter, not a bug. Tell Chidera so your account can be granted the key, and note it as blocked.</w:t>
             </w:r>
           </w:p>
         </w:tc>
@@ -4040,7 +3977,7 @@
                 <w:sz w:val="19"/>
                 <w:szCs w:val="19"/>
               </w:rPr>
-              <w:t xml:space="preserve">Permissions. Tell your lead.</w:t>
+              <w:t xml:space="preserve">Permissions. Tell Chidera.</w:t>
             </w:r>
           </w:p>
         </w:tc>
@@ -4365,7 +4302,7 @@
                 <w:sz w:val="20"/>
                 <w:szCs w:val="20"/>
               </w:rPr>
-              <w:t xml:space="preserve">Raise one URGENT ticket immediately with the step number and what happened, then tell your lead in the team channel. The rest of this pack assumes the spine works.</w:t>
+              <w:t xml:space="preserve">Raise one URGENT ticket immediately with the step number and what happened, then tell Chidera in the team channel. The rest of this pack assumes the spine works.</w:t>
             </w:r>
           </w:p>
         </w:tc>
@@ -5509,7 +5446,7 @@
           <w:sz w:val="21"/>
           <w:szCs w:val="21"/>
         </w:rPr>
-        <w:t xml:space="preserve">Confirm the current month is open. If it is not, stop, tell your lead, and mark this run blocked. Nothing else in this pack will post.</w:t>
+        <w:t xml:space="preserve">Confirm the current month is open. If it is not, stop, tell Chidera, and mark this run blocked. Nothing else in this pack will post.</w:t>
       </w:r>
     </w:p>
     <w:p>
@@ -6044,7 +5981,7 @@
           <w:sz w:val="21"/>
           <w:szCs w:val="21"/>
         </w:rPr>
-        <w:t xml:space="preserve">The base currency is clearly marked and is naira unless your lead says otherwise.</w:t>
+        <w:t xml:space="preserve">The base currency is clearly marked and is naira unless Chidera says otherwise.</w:t>
       </w:r>
     </w:p>
     <w:p>

</xml_diff>